<commit_message>
fix(briefings): correct Briefing 02 core position, approval paragraph, and closing line
Co-Authored-By: Claude Opus 5.5 <noreply@anthropic.com>
</commit_message>
<xml_diff>
--- a/briefings-source/Strategic_Intelligence_Briefing_02.docx
+++ b/briefings-source/Strategic_Intelligence_Briefing_02.docx
@@ -254,7 +254,7 @@
                 <w:color w:val="FFFFFF"/>
                 <w:sz w:val="24"/>
               </w:rPr>
-              <w:t>Decision Governance is the missing enterprise category because AI is no longer only a system to be managed. It is becoming a participant in consequential decision paths that require authority, traceability, escalation, and evidence before action moves forward.</w:t>
+              <w:t>Decision Governance is the missing enterprise category because AI agents no longer only produce output. They propose consequential executions that require authority, traceability, escalation, and evidence before the downstream system is affected.</w:t>
             </w:r>
           </w:p>
         </w:tc>
@@ -404,7 +404,7 @@
         <w:rPr>
           <w:rFonts w:ascii="Aptos" w:hAnsi="Aptos"/>
         </w:rPr>
-        <w:t>The same pattern appears across regulated workflows broadly. Even when a person remains in the process and a final action is manually approved, the control problem remains unresolved if the enterprise cannot prove how AI influenced the decision path, who had authority over the consequence, which rule applied, and why the action was allowed to proceed.</w:t>
+        <w:t>The same pattern appears across regulated workflows. A person may remain in the process and approve the final action by hand. The control problem remains unresolved if the enterprise cannot prove who held authority for that exact execution, which rule applied, and why it was allowed to run.</w:t>
       </w:r>
     </w:p>
     <w:p>
@@ -491,7 +491,7 @@
         <w:rPr>
           <w:rFonts w:ascii="Aptos" w:hAnsi="Aptos"/>
         </w:rPr>
-        <w:t>The missing enterprise category is Decision Governance. It names the control discipline enterprises will need as AI moves from generating output to shaping decisions.</w:t>
+        <w:t>The missing enterprise category is Decision Governance. It names the control discipline enterprises will need as AI moves from generating output to executing consequential actions.</w:t>
       </w:r>
     </w:p>
     <w:p>

</xml_diff>